<commit_message>
feat(phase-07): integration Sentinel complete
- Solution 'Microsoft Defender pour le cloud' installee via Content Hub
- Connecteur Subscription-based connecte (Azure subscription 1)
- 97 alertes confirmees dans Sentinel via KQL :
  - High   : 35
  - Medium : 53
  - Low    :  9
- Table SecurityAlert alimentee depuis Azure Security Center
- Chaine complete : Defender for Cloud -> Log Analytics -> Sentinel
</commit_message>
<xml_diff>
--- a/Microsoft Defender for Cloud.docx
+++ b/Microsoft Defender for Cloud.docx
@@ -7813,6 +7813,1617 @@
         </w:drawing>
       </w:r>
     </w:p>
+    <w:p/>
+    <w:p/>
+    <w:p>
+      <w:r>
+        <w:rPr>
+          <w:b/>
+          <w:bCs/>
+        </w:rPr>
+        <w:t>Phase 06 — Regulatory Compliance</w:t>
+      </w:r>
+    </w:p>
+    <w:p>
+      <w:r>
+        <w:rPr>
+          <w:b/>
+          <w:bCs/>
+        </w:rPr>
+        <w:t>Objectif</w:t>
+      </w:r>
+      <w:r>
+        <w:br/>
+        <w:t>Assigner des frameworks réglementaires à la subscription Azure et mesurer le niveau de conformité de l'environnement par rapport à des standards internationaux reconnus. C'est la démonstration concrète de la capacité à faire un audit de conformité cloud.</w:t>
+      </w:r>
+    </w:p>
+    <w:p>
+      <w:r>
+        <w:rPr>
+          <w:b/>
+          <w:bCs/>
+        </w:rPr>
+        <w:t>Frameworks ciblés</w:t>
+      </w:r>
+    </w:p>
+    <w:tbl>
+      <w:tblPr>
+        <w:tblStyle w:val="TableauGrille4-Accentuation2"/>
+        <w:tblW w:w="0" w:type="auto"/>
+        <w:tblLook w:val="04A0" w:firstRow="1" w:lastRow="0" w:firstColumn="1" w:lastColumn="0" w:noHBand="0" w:noVBand="1"/>
+      </w:tblPr>
+      <w:tblGrid>
+        <w:gridCol w:w="3279"/>
+        <w:gridCol w:w="2487"/>
+        <w:gridCol w:w="3296"/>
+      </w:tblGrid>
+      <w:tr>
+        <w:trPr>
+          <w:cnfStyle w:val="100000000000" w:firstRow="1" w:lastRow="0" w:firstColumn="0" w:lastColumn="0" w:oddVBand="0" w:evenVBand="0" w:oddHBand="0" w:evenHBand="0" w:firstRowFirstColumn="0" w:firstRowLastColumn="0" w:lastRowFirstColumn="0" w:lastRowLastColumn="0"/>
+        </w:trPr>
+        <w:tc>
+          <w:tcPr>
+            <w:cnfStyle w:val="001000000000" w:firstRow="0" w:lastRow="0" w:firstColumn="1" w:lastColumn="0" w:oddVBand="0" w:evenVBand="0" w:oddHBand="0" w:evenHBand="0" w:firstRowFirstColumn="0" w:firstRowLastColumn="0" w:lastRowFirstColumn="0" w:lastRowLastColumn="0"/>
+            <w:tcW w:w="0" w:type="auto"/>
+            <w:hideMark/>
+          </w:tcPr>
+          <w:p>
+            <w:pPr>
+              <w:spacing w:after="160" w:line="278" w:lineRule="auto"/>
+            </w:pPr>
+            <w:r>
+              <w:t>Framework</w:t>
+            </w:r>
+          </w:p>
+        </w:tc>
+        <w:tc>
+          <w:tcPr>
+            <w:tcW w:w="0" w:type="auto"/>
+            <w:hideMark/>
+          </w:tcPr>
+          <w:p>
+            <w:pPr>
+              <w:spacing w:after="160" w:line="278" w:lineRule="auto"/>
+              <w:cnfStyle w:val="100000000000" w:firstRow="1" w:lastRow="0" w:firstColumn="0" w:lastColumn="0" w:oddVBand="0" w:evenVBand="0" w:oddHBand="0" w:evenHBand="0" w:firstRowFirstColumn="0" w:firstRowLastColumn="0" w:lastRowFirstColumn="0" w:lastRowLastColumn="0"/>
+            </w:pPr>
+            <w:r>
+              <w:t>Domaine</w:t>
+            </w:r>
+          </w:p>
+        </w:tc>
+        <w:tc>
+          <w:tcPr>
+            <w:tcW w:w="0" w:type="auto"/>
+            <w:hideMark/>
+          </w:tcPr>
+          <w:p>
+            <w:pPr>
+              <w:spacing w:after="160" w:line="278" w:lineRule="auto"/>
+              <w:cnfStyle w:val="100000000000" w:firstRow="1" w:lastRow="0" w:firstColumn="0" w:lastColumn="0" w:oddVBand="0" w:evenVBand="0" w:oddHBand="0" w:evenHBand="0" w:firstRowFirstColumn="0" w:firstRowLastColumn="0" w:lastRowFirstColumn="0" w:lastRowLastColumn="0"/>
+            </w:pPr>
+            <w:r>
+              <w:t>Pourquoi</w:t>
+            </w:r>
+          </w:p>
+        </w:tc>
+      </w:tr>
+      <w:tr>
+        <w:trPr>
+          <w:cnfStyle w:val="000000100000" w:firstRow="0" w:lastRow="0" w:firstColumn="0" w:lastColumn="0" w:oddVBand="0" w:evenVBand="0" w:oddHBand="1" w:evenHBand="0" w:firstRowFirstColumn="0" w:firstRowLastColumn="0" w:lastRowFirstColumn="0" w:lastRowLastColumn="0"/>
+        </w:trPr>
+        <w:tc>
+          <w:tcPr>
+            <w:cnfStyle w:val="001000000000" w:firstRow="0" w:lastRow="0" w:firstColumn="1" w:lastColumn="0" w:oddVBand="0" w:evenVBand="0" w:oddHBand="0" w:evenHBand="0" w:firstRowFirstColumn="0" w:firstRowLastColumn="0" w:lastRowFirstColumn="0" w:lastRowLastColumn="0"/>
+            <w:tcW w:w="0" w:type="auto"/>
+            <w:hideMark/>
+          </w:tcPr>
+          <w:p>
+            <w:pPr>
+              <w:spacing w:after="160" w:line="278" w:lineRule="auto"/>
+            </w:pPr>
+            <w:r>
+              <w:t>CIS Microsoft Azure Foundations Benchmark v1.4</w:t>
+            </w:r>
+          </w:p>
+        </w:tc>
+        <w:tc>
+          <w:tcPr>
+            <w:tcW w:w="0" w:type="auto"/>
+            <w:hideMark/>
+          </w:tcPr>
+          <w:p>
+            <w:pPr>
+              <w:spacing w:after="160" w:line="278" w:lineRule="auto"/>
+              <w:cnfStyle w:val="000000100000" w:firstRow="0" w:lastRow="0" w:firstColumn="0" w:lastColumn="0" w:oddVBand="0" w:evenVBand="0" w:oddHBand="1" w:evenHBand="0" w:firstRowFirstColumn="0" w:firstRowLastColumn="0" w:lastRowFirstColumn="0" w:lastRowLastColumn="0"/>
+            </w:pPr>
+            <w:r>
+              <w:t>Sécurité technique Azure</w:t>
+            </w:r>
+          </w:p>
+        </w:tc>
+        <w:tc>
+          <w:tcPr>
+            <w:tcW w:w="0" w:type="auto"/>
+            <w:hideMark/>
+          </w:tcPr>
+          <w:p>
+            <w:pPr>
+              <w:spacing w:after="160" w:line="278" w:lineRule="auto"/>
+              <w:cnfStyle w:val="000000100000" w:firstRow="0" w:lastRow="0" w:firstColumn="0" w:lastColumn="0" w:oddVBand="0" w:evenVBand="0" w:oddHBand="1" w:evenHBand="0" w:firstRowFirstColumn="0" w:firstRowLastColumn="0" w:lastRowFirstColumn="0" w:lastRowLastColumn="0"/>
+            </w:pPr>
+            <w:r>
+              <w:t>Standard de référence pour les audits Azure</w:t>
+            </w:r>
+          </w:p>
+        </w:tc>
+      </w:tr>
+      <w:tr>
+        <w:tc>
+          <w:tcPr>
+            <w:cnfStyle w:val="001000000000" w:firstRow="0" w:lastRow="0" w:firstColumn="1" w:lastColumn="0" w:oddVBand="0" w:evenVBand="0" w:oddHBand="0" w:evenHBand="0" w:firstRowFirstColumn="0" w:firstRowLastColumn="0" w:lastRowFirstColumn="0" w:lastRowLastColumn="0"/>
+            <w:tcW w:w="0" w:type="auto"/>
+            <w:hideMark/>
+          </w:tcPr>
+          <w:p>
+            <w:pPr>
+              <w:spacing w:after="160" w:line="278" w:lineRule="auto"/>
+            </w:pPr>
+            <w:r>
+              <w:t>NIST SP 800-53 R5</w:t>
+            </w:r>
+          </w:p>
+        </w:tc>
+        <w:tc>
+          <w:tcPr>
+            <w:tcW w:w="0" w:type="auto"/>
+            <w:hideMark/>
+          </w:tcPr>
+          <w:p>
+            <w:pPr>
+              <w:spacing w:after="160" w:line="278" w:lineRule="auto"/>
+              <w:cnfStyle w:val="000000000000" w:firstRow="0" w:lastRow="0" w:firstColumn="0" w:lastColumn="0" w:oddVBand="0" w:evenVBand="0" w:oddHBand="0" w:evenHBand="0" w:firstRowFirstColumn="0" w:firstRowLastColumn="0" w:lastRowFirstColumn="0" w:lastRowLastColumn="0"/>
+            </w:pPr>
+            <w:r>
+              <w:t>Gouvernance / Risk / Compliance</w:t>
+            </w:r>
+          </w:p>
+        </w:tc>
+        <w:tc>
+          <w:tcPr>
+            <w:tcW w:w="0" w:type="auto"/>
+            <w:hideMark/>
+          </w:tcPr>
+          <w:p>
+            <w:pPr>
+              <w:spacing w:after="160" w:line="278" w:lineRule="auto"/>
+              <w:cnfStyle w:val="000000000000" w:firstRow="0" w:lastRow="0" w:firstColumn="0" w:lastColumn="0" w:oddVBand="0" w:evenVBand="0" w:oddHBand="0" w:evenHBand="0" w:firstRowFirstColumn="0" w:firstRowLastColumn="0" w:lastRowFirstColumn="0" w:lastRowLastColumn="0"/>
+            </w:pPr>
+            <w:r>
+              <w:t>Framework US utilisé en contexte enterprise et défense</w:t>
+            </w:r>
+          </w:p>
+        </w:tc>
+      </w:tr>
+    </w:tbl>
+    <w:p>
+      <w:r>
+        <w:rPr>
+          <w:b/>
+          <w:bCs/>
+        </w:rPr>
+        <w:t>Livrable attendu</w:t>
+      </w:r>
+    </w:p>
+    <w:p>
+      <w:pPr>
+        <w:numPr>
+          <w:ilvl w:val="0"/>
+          <w:numId w:val="6"/>
+        </w:numPr>
+      </w:pPr>
+      <w:r>
+        <w:t>% de controls passés sur CIS Benchmark</w:t>
+      </w:r>
+    </w:p>
+    <w:p>
+      <w:pPr>
+        <w:numPr>
+          <w:ilvl w:val="0"/>
+          <w:numId w:val="6"/>
+        </w:numPr>
+      </w:pPr>
+      <w:r>
+        <w:t>% de controls passés sur NIST 800-53</w:t>
+      </w:r>
+    </w:p>
+    <w:p>
+      <w:pPr>
+        <w:numPr>
+          <w:ilvl w:val="0"/>
+          <w:numId w:val="6"/>
+        </w:numPr>
+      </w:pPr>
+      <w:r>
+        <w:lastRenderedPageBreak/>
+        <w:t>Screenshot du tableau de bord Regulatory Compliance</w:t>
+      </w:r>
+    </w:p>
+    <w:p/>
+    <w:p/>
+    <w:p/>
+    <w:p>
+      <w:r>
+        <w:t>Phase 06 — Assigner les frameworks</w:t>
+      </w:r>
+    </w:p>
+    <w:p>
+      <w:r>
+        <w:t>cd "D:\personnel-ivan\PROJETS-PERSO-LAB\Microsoft Defender for Cloud"</w:t>
+      </w:r>
+    </w:p>
+    <w:p>
+      <w:r>
+        <w:t># Voir les frameworks disponibles sur ta subscription</w:t>
+      </w:r>
+    </w:p>
+    <w:p>
+      <w:r>
+        <w:t>Get-AzSecurityCompliance | Select-Object Name | Format-Table</w:t>
+      </w:r>
+    </w:p>
+    <w:p>
+      <w:r>
+        <w:rPr>
+          <w:noProof/>
+        </w:rPr>
+        <w:drawing>
+          <wp:inline distT="0" distB="0" distL="0" distR="0" wp14:anchorId="1B13D0E5" wp14:editId="264B10FA">
+            <wp:extent cx="5760720" cy="2219960"/>
+            <wp:effectExtent l="0" t="0" r="0" b="8890"/>
+            <wp:docPr id="23781559" name="Image 1"/>
+            <wp:cNvGraphicFramePr>
+              <a:graphicFrameLocks xmlns:a="http://schemas.openxmlformats.org/drawingml/2006/main" noChangeAspect="1"/>
+            </wp:cNvGraphicFramePr>
+            <a:graphic xmlns:a="http://schemas.openxmlformats.org/drawingml/2006/main">
+              <a:graphicData uri="http://schemas.openxmlformats.org/drawingml/2006/picture">
+                <pic:pic xmlns:pic="http://schemas.openxmlformats.org/drawingml/2006/picture">
+                  <pic:nvPicPr>
+                    <pic:cNvPr id="23781559" name=""/>
+                    <pic:cNvPicPr/>
+                  </pic:nvPicPr>
+                  <pic:blipFill>
+                    <a:blip r:embed="rId58"/>
+                    <a:stretch>
+                      <a:fillRect/>
+                    </a:stretch>
+                  </pic:blipFill>
+                  <pic:spPr>
+                    <a:xfrm>
+                      <a:off x="0" y="0"/>
+                      <a:ext cx="5760720" cy="2219960"/>
+                    </a:xfrm>
+                    <a:prstGeom prst="rect">
+                      <a:avLst/>
+                    </a:prstGeom>
+                  </pic:spPr>
+                </pic:pic>
+              </a:graphicData>
+            </a:graphic>
+          </wp:inline>
+        </w:drawing>
+      </w:r>
+    </w:p>
+    <w:p/>
+    <w:p/>
+    <w:p>
+      <w:r>
+        <w:t># Via portail (FR) — plus fiable pour l'assignation :</w:t>
+      </w:r>
+    </w:p>
+    <w:p>
+      <w:r>
+        <w:t># Microsoft Defender pour le cloud</w:t>
+      </w:r>
+    </w:p>
+    <w:p>
+      <w:r>
+        <w:t># → Conformité réglementaire (menu gauche)</w:t>
+      </w:r>
+    </w:p>
+    <w:p>
+      <w:r>
+        <w:t># → Gérer les stratégies de conformité</w:t>
+      </w:r>
+    </w:p>
+    <w:p>
+      <w:r>
+        <w:rPr>
+          <w:noProof/>
+        </w:rPr>
+        <w:lastRenderedPageBreak/>
+        <w:drawing>
+          <wp:inline distT="0" distB="0" distL="0" distR="0" wp14:anchorId="53E9C7A5" wp14:editId="0CF870D5">
+            <wp:extent cx="5760720" cy="3406775"/>
+            <wp:effectExtent l="0" t="0" r="0" b="3175"/>
+            <wp:docPr id="1182993132" name="Image 1"/>
+            <wp:cNvGraphicFramePr>
+              <a:graphicFrameLocks xmlns:a="http://schemas.openxmlformats.org/drawingml/2006/main" noChangeAspect="1"/>
+            </wp:cNvGraphicFramePr>
+            <a:graphic xmlns:a="http://schemas.openxmlformats.org/drawingml/2006/main">
+              <a:graphicData uri="http://schemas.openxmlformats.org/drawingml/2006/picture">
+                <pic:pic xmlns:pic="http://schemas.openxmlformats.org/drawingml/2006/picture">
+                  <pic:nvPicPr>
+                    <pic:cNvPr id="1182993132" name=""/>
+                    <pic:cNvPicPr/>
+                  </pic:nvPicPr>
+                  <pic:blipFill>
+                    <a:blip r:embed="rId59"/>
+                    <a:stretch>
+                      <a:fillRect/>
+                    </a:stretch>
+                  </pic:blipFill>
+                  <pic:spPr>
+                    <a:xfrm>
+                      <a:off x="0" y="0"/>
+                      <a:ext cx="5760720" cy="3406775"/>
+                    </a:xfrm>
+                    <a:prstGeom prst="rect">
+                      <a:avLst/>
+                    </a:prstGeom>
+                  </pic:spPr>
+                </pic:pic>
+              </a:graphicData>
+            </a:graphic>
+          </wp:inline>
+        </w:drawing>
+      </w:r>
+    </w:p>
+    <w:p>
+      <w:r>
+        <w:rPr>
+          <w:noProof/>
+        </w:rPr>
+        <w:drawing>
+          <wp:inline distT="0" distB="0" distL="0" distR="0" wp14:anchorId="679BBFF3" wp14:editId="50E097AA">
+            <wp:extent cx="5760720" cy="2545715"/>
+            <wp:effectExtent l="0" t="0" r="0" b="6985"/>
+            <wp:docPr id="1552381424" name="Image 1"/>
+            <wp:cNvGraphicFramePr>
+              <a:graphicFrameLocks xmlns:a="http://schemas.openxmlformats.org/drawingml/2006/main" noChangeAspect="1"/>
+            </wp:cNvGraphicFramePr>
+            <a:graphic xmlns:a="http://schemas.openxmlformats.org/drawingml/2006/main">
+              <a:graphicData uri="http://schemas.openxmlformats.org/drawingml/2006/picture">
+                <pic:pic xmlns:pic="http://schemas.openxmlformats.org/drawingml/2006/picture">
+                  <pic:nvPicPr>
+                    <pic:cNvPr id="1552381424" name=""/>
+                    <pic:cNvPicPr/>
+                  </pic:nvPicPr>
+                  <pic:blipFill>
+                    <a:blip r:embed="rId60"/>
+                    <a:stretch>
+                      <a:fillRect/>
+                    </a:stretch>
+                  </pic:blipFill>
+                  <pic:spPr>
+                    <a:xfrm>
+                      <a:off x="0" y="0"/>
+                      <a:ext cx="5760720" cy="2545715"/>
+                    </a:xfrm>
+                    <a:prstGeom prst="rect">
+                      <a:avLst/>
+                    </a:prstGeom>
+                  </pic:spPr>
+                </pic:pic>
+              </a:graphicData>
+            </a:graphic>
+          </wp:inline>
+        </w:drawing>
+      </w:r>
+    </w:p>
+    <w:p>
+      <w:r>
+        <w:rPr>
+          <w:noProof/>
+        </w:rPr>
+        <w:lastRenderedPageBreak/>
+        <w:drawing>
+          <wp:inline distT="0" distB="0" distL="0" distR="0" wp14:anchorId="56A7E6ED" wp14:editId="381BB68A">
+            <wp:extent cx="5760720" cy="3687445"/>
+            <wp:effectExtent l="0" t="0" r="0" b="8255"/>
+            <wp:docPr id="1632981310" name="Image 1"/>
+            <wp:cNvGraphicFramePr>
+              <a:graphicFrameLocks xmlns:a="http://schemas.openxmlformats.org/drawingml/2006/main" noChangeAspect="1"/>
+            </wp:cNvGraphicFramePr>
+            <a:graphic xmlns:a="http://schemas.openxmlformats.org/drawingml/2006/main">
+              <a:graphicData uri="http://schemas.openxmlformats.org/drawingml/2006/picture">
+                <pic:pic xmlns:pic="http://schemas.openxmlformats.org/drawingml/2006/picture">
+                  <pic:nvPicPr>
+                    <pic:cNvPr id="1632981310" name=""/>
+                    <pic:cNvPicPr/>
+                  </pic:nvPicPr>
+                  <pic:blipFill>
+                    <a:blip r:embed="rId61"/>
+                    <a:stretch>
+                      <a:fillRect/>
+                    </a:stretch>
+                  </pic:blipFill>
+                  <pic:spPr>
+                    <a:xfrm>
+                      <a:off x="0" y="0"/>
+                      <a:ext cx="5760720" cy="3687445"/>
+                    </a:xfrm>
+                    <a:prstGeom prst="rect">
+                      <a:avLst/>
+                    </a:prstGeom>
+                  </pic:spPr>
+                </pic:pic>
+              </a:graphicData>
+            </a:graphic>
+          </wp:inline>
+        </w:drawing>
+      </w:r>
+    </w:p>
+    <w:p/>
+    <w:p>
+      <w:r>
+        <w:rPr>
+          <w:noProof/>
+        </w:rPr>
+        <w:drawing>
+          <wp:inline distT="0" distB="0" distL="0" distR="0" wp14:anchorId="59A07138" wp14:editId="5A521307">
+            <wp:extent cx="5760720" cy="3014345"/>
+            <wp:effectExtent l="0" t="0" r="0" b="0"/>
+            <wp:docPr id="1573315941" name="Image 1"/>
+            <wp:cNvGraphicFramePr>
+              <a:graphicFrameLocks xmlns:a="http://schemas.openxmlformats.org/drawingml/2006/main" noChangeAspect="1"/>
+            </wp:cNvGraphicFramePr>
+            <a:graphic xmlns:a="http://schemas.openxmlformats.org/drawingml/2006/main">
+              <a:graphicData uri="http://schemas.openxmlformats.org/drawingml/2006/picture">
+                <pic:pic xmlns:pic="http://schemas.openxmlformats.org/drawingml/2006/picture">
+                  <pic:nvPicPr>
+                    <pic:cNvPr id="1573315941" name=""/>
+                    <pic:cNvPicPr/>
+                  </pic:nvPicPr>
+                  <pic:blipFill>
+                    <a:blip r:embed="rId62"/>
+                    <a:stretch>
+                      <a:fillRect/>
+                    </a:stretch>
+                  </pic:blipFill>
+                  <pic:spPr>
+                    <a:xfrm>
+                      <a:off x="0" y="0"/>
+                      <a:ext cx="5760720" cy="3014345"/>
+                    </a:xfrm>
+                    <a:prstGeom prst="rect">
+                      <a:avLst/>
+                    </a:prstGeom>
+                  </pic:spPr>
+                </pic:pic>
+              </a:graphicData>
+            </a:graphic>
+          </wp:inline>
+        </w:drawing>
+      </w:r>
+    </w:p>
+    <w:p>
+      <w:pPr>
+        <w:rPr>
+          <w:b/>
+          <w:bCs/>
+        </w:rPr>
+      </w:pPr>
+      <w:r>
+        <w:rPr>
+          <w:b/>
+          <w:bCs/>
+        </w:rPr>
+        <w:t>Active ces 2 normes maintenant</w:t>
+      </w:r>
+    </w:p>
+    <w:p>
+      <w:r>
+        <w:rPr>
+          <w:b/>
+          <w:bCs/>
+        </w:rPr>
+        <w:t>Directement avec les toggles sur ta page :</w:t>
+      </w:r>
+    </w:p>
+    <w:p>
+      <w:r>
+        <w:t>1. CIS Microsoft Azure Foundations Benchmark v2.0.0</w:t>
+      </w:r>
+    </w:p>
+    <w:p>
+      <w:r>
+        <w:t xml:space="preserve">   → Toggle : Désactivées → clic pour Activer </w:t>
+      </w:r>
+      <w:r>
+        <w:rPr>
+          <w:rFonts w:ascii="Segoe UI Emoji" w:hAnsi="Segoe UI Emoji" w:cs="Segoe UI Emoji"/>
+        </w:rPr>
+        <w:t>✅</w:t>
+      </w:r>
+    </w:p>
+    <w:p>
+      <w:r>
+        <w:t xml:space="preserve">   → Confirmer l'attribution si une fenêtre s'ouvre</w:t>
+      </w:r>
+    </w:p>
+    <w:p/>
+    <w:p>
+      <w:r>
+        <w:t>2. NIST SP 800-53 Rev. 5</w:t>
+      </w:r>
+    </w:p>
+    <w:p>
+      <w:r>
+        <w:t xml:space="preserve">   → Toggle : Désactivées → clic pour Activer </w:t>
+      </w:r>
+      <w:r>
+        <w:rPr>
+          <w:rFonts w:ascii="Segoe UI Emoji" w:hAnsi="Segoe UI Emoji" w:cs="Segoe UI Emoji"/>
+        </w:rPr>
+        <w:t>✅</w:t>
+      </w:r>
+    </w:p>
+    <w:p>
+      <w:r>
+        <w:t xml:space="preserve">   → Confirmer l'attribution si une fenêtre s'ouvre</w:t>
+      </w:r>
+    </w:p>
+    <w:p>
+      <w:r>
+        <w:rPr>
+          <w:noProof/>
+        </w:rPr>
+        <w:drawing>
+          <wp:inline distT="0" distB="0" distL="0" distR="0" wp14:anchorId="164400FD" wp14:editId="2440333B">
+            <wp:extent cx="5760720" cy="2823845"/>
+            <wp:effectExtent l="0" t="0" r="0" b="0"/>
+            <wp:docPr id="20353624" name="Image 1"/>
+            <wp:cNvGraphicFramePr>
+              <a:graphicFrameLocks xmlns:a="http://schemas.openxmlformats.org/drawingml/2006/main" noChangeAspect="1"/>
+            </wp:cNvGraphicFramePr>
+            <a:graphic xmlns:a="http://schemas.openxmlformats.org/drawingml/2006/main">
+              <a:graphicData uri="http://schemas.openxmlformats.org/drawingml/2006/picture">
+                <pic:pic xmlns:pic="http://schemas.openxmlformats.org/drawingml/2006/picture">
+                  <pic:nvPicPr>
+                    <pic:cNvPr id="20353624" name=""/>
+                    <pic:cNvPicPr/>
+                  </pic:nvPicPr>
+                  <pic:blipFill>
+                    <a:blip r:embed="rId63"/>
+                    <a:stretch>
+                      <a:fillRect/>
+                    </a:stretch>
+                  </pic:blipFill>
+                  <pic:spPr>
+                    <a:xfrm>
+                      <a:off x="0" y="0"/>
+                      <a:ext cx="5760720" cy="2823845"/>
+                    </a:xfrm>
+                    <a:prstGeom prst="rect">
+                      <a:avLst/>
+                    </a:prstGeom>
+                  </pic:spPr>
+                </pic:pic>
+              </a:graphicData>
+            </a:graphic>
+          </wp:inline>
+        </w:drawing>
+      </w:r>
+    </w:p>
+    <w:p>
+      <w:pPr>
+        <w:rPr>
+          <w:b/>
+          <w:bCs/>
+        </w:rPr>
+      </w:pPr>
+      <w:r>
+        <w:rPr>
+          <w:b/>
+          <w:bCs/>
+        </w:rPr>
+        <w:t>Pourquoi ces deux normes — contenu Word</w:t>
+      </w:r>
+    </w:p>
+    <w:p>
+      <w:r>
+        <w:t xml:space="preserve">Ajoute ça dans le Word, section </w:t>
+      </w:r>
+      <w:r>
+        <w:rPr>
+          <w:b/>
+          <w:bCs/>
+        </w:rPr>
+        <w:t>Phase 06 — Regulatory Compliance</w:t>
+      </w:r>
+      <w:r>
+        <w:t xml:space="preserve"> :</w:t>
+      </w:r>
+    </w:p>
+    <w:p>
+      <w:r>
+        <w:pict w14:anchorId="6964D3EF">
+          <v:rect id="_x0000_i1073" style="width:0;height:1.5pt" o:hralign="center" o:hrstd="t" o:hr="t" fillcolor="#a0a0a0" stroked="f"/>
+        </w:pict>
+      </w:r>
+    </w:p>
+    <w:p>
+      <w:r>
+        <w:rPr>
+          <w:b/>
+          <w:bCs/>
+        </w:rPr>
+        <w:t>Pourquoi CIS Microsoft Azure Foundations Benchmark v2.0.0</w:t>
+      </w:r>
+    </w:p>
+    <w:p>
+      <w:r>
+        <w:t xml:space="preserve">Le CIS (Center for Internet Security) Benchmark Azure est </w:t>
+      </w:r>
+      <w:r>
+        <w:rPr>
+          <w:b/>
+          <w:bCs/>
+        </w:rPr>
+        <w:t>le standard de référence technique pour auditer la sécurité d'un environnement Azure</w:t>
+      </w:r>
+      <w:r>
+        <w:t>. Il est utilisé par les auditeurs, les RSSI et les équipes SOC du monde entier. Il couvre 108 contrôles techniques concrets : chiffrement, gestion des accès, logging, réseau, stockage. En entreprise, c'est souvent le premier framework demandé lors d'un audit cloud. L'activer dans Defender for Cloud permet de voir immédiatement quels contrôles techniques sont passés ou échoués sur ta subscription.</w:t>
+      </w:r>
+    </w:p>
+    <w:p>
+      <w:r>
+        <w:rPr>
+          <w:b/>
+          <w:bCs/>
+        </w:rPr>
+        <w:t>Pourquoi NIST SP 800-53 Rev. 5</w:t>
+      </w:r>
+    </w:p>
+    <w:p>
+      <w:r>
+        <w:t>Le NIST 800-53 est le framework de sécurité de référence du gouvernement américain, largement adopté en contexte enterprise, défense et secteur public en Europe. Il couvre 696 contrôles répartis en 20 familles (AC, AU, CM, IA, SI...) incluant la gouvernance, la gestion des risques et la conformité organisationnelle — au-delà du technique pur. Le mentionner en entretien ou dans un rapport PSSI montre une culture GRC (Governance, Risk, Compliance) au-delà de la technique pure.</w:t>
+      </w:r>
+    </w:p>
+    <w:p>
+      <w:r>
+        <w:rPr>
+          <w:b/>
+          <w:bCs/>
+        </w:rPr>
+        <w:lastRenderedPageBreak/>
+        <w:t>Ce que ça apporte au lab</w:t>
+      </w:r>
+    </w:p>
+    <w:tbl>
+      <w:tblPr>
+        <w:tblStyle w:val="TableauGrille5Fonc-Accentuation2"/>
+        <w:tblW w:w="0" w:type="auto"/>
+        <w:tblLook w:val="04A0" w:firstRow="1" w:lastRow="0" w:firstColumn="1" w:lastColumn="0" w:noHBand="0" w:noVBand="1"/>
+      </w:tblPr>
+      <w:tblGrid>
+        <w:gridCol w:w="3842"/>
+        <w:gridCol w:w="1166"/>
+        <w:gridCol w:w="4054"/>
+      </w:tblGrid>
+      <w:tr>
+        <w:trPr>
+          <w:cnfStyle w:val="100000000000" w:firstRow="1" w:lastRow="0" w:firstColumn="0" w:lastColumn="0" w:oddVBand="0" w:evenVBand="0" w:oddHBand="0" w:evenHBand="0" w:firstRowFirstColumn="0" w:firstRowLastColumn="0" w:lastRowFirstColumn="0" w:lastRowLastColumn="0"/>
+        </w:trPr>
+        <w:tc>
+          <w:tcPr>
+            <w:cnfStyle w:val="001000000000" w:firstRow="0" w:lastRow="0" w:firstColumn="1" w:lastColumn="0" w:oddVBand="0" w:evenVBand="0" w:oddHBand="0" w:evenHBand="0" w:firstRowFirstColumn="0" w:firstRowLastColumn="0" w:lastRowFirstColumn="0" w:lastRowLastColumn="0"/>
+            <w:tcW w:w="0" w:type="auto"/>
+            <w:hideMark/>
+          </w:tcPr>
+          <w:p>
+            <w:pPr>
+              <w:spacing w:after="160" w:line="278" w:lineRule="auto"/>
+            </w:pPr>
+            <w:r>
+              <w:t>Framework</w:t>
+            </w:r>
+          </w:p>
+        </w:tc>
+        <w:tc>
+          <w:tcPr>
+            <w:tcW w:w="0" w:type="auto"/>
+            <w:hideMark/>
+          </w:tcPr>
+          <w:p>
+            <w:pPr>
+              <w:spacing w:after="160" w:line="278" w:lineRule="auto"/>
+              <w:cnfStyle w:val="100000000000" w:firstRow="1" w:lastRow="0" w:firstColumn="0" w:lastColumn="0" w:oddVBand="0" w:evenVBand="0" w:oddHBand="0" w:evenHBand="0" w:firstRowFirstColumn="0" w:firstRowLastColumn="0" w:lastRowFirstColumn="0" w:lastRowLastColumn="0"/>
+            </w:pPr>
+            <w:r>
+              <w:t>Controls</w:t>
+            </w:r>
+          </w:p>
+        </w:tc>
+        <w:tc>
+          <w:tcPr>
+            <w:tcW w:w="0" w:type="auto"/>
+            <w:hideMark/>
+          </w:tcPr>
+          <w:p>
+            <w:pPr>
+              <w:spacing w:after="160" w:line="278" w:lineRule="auto"/>
+              <w:cnfStyle w:val="100000000000" w:firstRow="1" w:lastRow="0" w:firstColumn="0" w:lastColumn="0" w:oddVBand="0" w:evenVBand="0" w:oddHBand="0" w:evenHBand="0" w:firstRowFirstColumn="0" w:firstRowLastColumn="0" w:lastRowFirstColumn="0" w:lastRowLastColumn="0"/>
+            </w:pPr>
+            <w:r>
+              <w:t>Ce que ça mesure</w:t>
+            </w:r>
+          </w:p>
+        </w:tc>
+      </w:tr>
+      <w:tr>
+        <w:trPr>
+          <w:cnfStyle w:val="000000100000" w:firstRow="0" w:lastRow="0" w:firstColumn="0" w:lastColumn="0" w:oddVBand="0" w:evenVBand="0" w:oddHBand="1" w:evenHBand="0" w:firstRowFirstColumn="0" w:firstRowLastColumn="0" w:lastRowFirstColumn="0" w:lastRowLastColumn="0"/>
+        </w:trPr>
+        <w:tc>
+          <w:tcPr>
+            <w:cnfStyle w:val="001000000000" w:firstRow="0" w:lastRow="0" w:firstColumn="1" w:lastColumn="0" w:oddVBand="0" w:evenVBand="0" w:oddHBand="0" w:evenHBand="0" w:firstRowFirstColumn="0" w:firstRowLastColumn="0" w:lastRowFirstColumn="0" w:lastRowLastColumn="0"/>
+            <w:tcW w:w="0" w:type="auto"/>
+            <w:hideMark/>
+          </w:tcPr>
+          <w:p>
+            <w:pPr>
+              <w:spacing w:after="160" w:line="278" w:lineRule="auto"/>
+            </w:pPr>
+            <w:r>
+              <w:t>Microsoft Cloud Security Benchmark</w:t>
+            </w:r>
+          </w:p>
+        </w:tc>
+        <w:tc>
+          <w:tcPr>
+            <w:tcW w:w="0" w:type="auto"/>
+            <w:hideMark/>
+          </w:tcPr>
+          <w:p>
+            <w:pPr>
+              <w:spacing w:after="160" w:line="278" w:lineRule="auto"/>
+              <w:cnfStyle w:val="000000100000" w:firstRow="0" w:lastRow="0" w:firstColumn="0" w:lastColumn="0" w:oddVBand="0" w:evenVBand="0" w:oddHBand="1" w:evenHBand="0" w:firstRowFirstColumn="0" w:firstRowLastColumn="0" w:lastRowFirstColumn="0" w:lastRowLastColumn="0"/>
+            </w:pPr>
+            <w:r>
+              <w:t>223</w:t>
+            </w:r>
+          </w:p>
+        </w:tc>
+        <w:tc>
+          <w:tcPr>
+            <w:tcW w:w="0" w:type="auto"/>
+            <w:hideMark/>
+          </w:tcPr>
+          <w:p>
+            <w:pPr>
+              <w:spacing w:after="160" w:line="278" w:lineRule="auto"/>
+              <w:cnfStyle w:val="000000100000" w:firstRow="0" w:lastRow="0" w:firstColumn="0" w:lastColumn="0" w:oddVBand="0" w:evenVBand="0" w:oddHBand="1" w:evenHBand="0" w:firstRowFirstColumn="0" w:firstRowLastColumn="0" w:lastRowFirstColumn="0" w:lastRowLastColumn="0"/>
+            </w:pPr>
+            <w:r>
+              <w:t>Baseline Microsoft (actif par défaut)</w:t>
+            </w:r>
+          </w:p>
+        </w:tc>
+      </w:tr>
+      <w:tr>
+        <w:tc>
+          <w:tcPr>
+            <w:cnfStyle w:val="001000000000" w:firstRow="0" w:lastRow="0" w:firstColumn="1" w:lastColumn="0" w:oddVBand="0" w:evenVBand="0" w:oddHBand="0" w:evenHBand="0" w:firstRowFirstColumn="0" w:firstRowLastColumn="0" w:lastRowFirstColumn="0" w:lastRowLastColumn="0"/>
+            <w:tcW w:w="0" w:type="auto"/>
+            <w:hideMark/>
+          </w:tcPr>
+          <w:p>
+            <w:pPr>
+              <w:spacing w:after="160" w:line="278" w:lineRule="auto"/>
+            </w:pPr>
+            <w:r>
+              <w:t>CIS Azure Foundations v2.0.0</w:t>
+            </w:r>
+          </w:p>
+        </w:tc>
+        <w:tc>
+          <w:tcPr>
+            <w:tcW w:w="0" w:type="auto"/>
+            <w:hideMark/>
+          </w:tcPr>
+          <w:p>
+            <w:pPr>
+              <w:spacing w:after="160" w:line="278" w:lineRule="auto"/>
+              <w:cnfStyle w:val="000000000000" w:firstRow="0" w:lastRow="0" w:firstColumn="0" w:lastColumn="0" w:oddVBand="0" w:evenVBand="0" w:oddHBand="0" w:evenHBand="0" w:firstRowFirstColumn="0" w:firstRowLastColumn="0" w:lastRowFirstColumn="0" w:lastRowLastColumn="0"/>
+            </w:pPr>
+            <w:r>
+              <w:t>108</w:t>
+            </w:r>
+          </w:p>
+        </w:tc>
+        <w:tc>
+          <w:tcPr>
+            <w:tcW w:w="0" w:type="auto"/>
+            <w:hideMark/>
+          </w:tcPr>
+          <w:p>
+            <w:pPr>
+              <w:spacing w:after="160" w:line="278" w:lineRule="auto"/>
+              <w:cnfStyle w:val="000000000000" w:firstRow="0" w:lastRow="0" w:firstColumn="0" w:lastColumn="0" w:oddVBand="0" w:evenVBand="0" w:oddHBand="0" w:evenHBand="0" w:firstRowFirstColumn="0" w:firstRowLastColumn="0" w:lastRowFirstColumn="0" w:lastRowLastColumn="0"/>
+            </w:pPr>
+            <w:r>
+              <w:t>Hardening technique Azure</w:t>
+            </w:r>
+          </w:p>
+        </w:tc>
+      </w:tr>
+      <w:tr>
+        <w:trPr>
+          <w:cnfStyle w:val="000000100000" w:firstRow="0" w:lastRow="0" w:firstColumn="0" w:lastColumn="0" w:oddVBand="0" w:evenVBand="0" w:oddHBand="1" w:evenHBand="0" w:firstRowFirstColumn="0" w:firstRowLastColumn="0" w:lastRowFirstColumn="0" w:lastRowLastColumn="0"/>
+        </w:trPr>
+        <w:tc>
+          <w:tcPr>
+            <w:cnfStyle w:val="001000000000" w:firstRow="0" w:lastRow="0" w:firstColumn="1" w:lastColumn="0" w:oddVBand="0" w:evenVBand="0" w:oddHBand="0" w:evenHBand="0" w:firstRowFirstColumn="0" w:firstRowLastColumn="0" w:lastRowFirstColumn="0" w:lastRowLastColumn="0"/>
+            <w:tcW w:w="0" w:type="auto"/>
+            <w:hideMark/>
+          </w:tcPr>
+          <w:p>
+            <w:pPr>
+              <w:spacing w:after="160" w:line="278" w:lineRule="auto"/>
+            </w:pPr>
+            <w:r>
+              <w:t>NIST SP 800-53 Rev. 5</w:t>
+            </w:r>
+          </w:p>
+        </w:tc>
+        <w:tc>
+          <w:tcPr>
+            <w:tcW w:w="0" w:type="auto"/>
+            <w:hideMark/>
+          </w:tcPr>
+          <w:p>
+            <w:pPr>
+              <w:spacing w:after="160" w:line="278" w:lineRule="auto"/>
+              <w:cnfStyle w:val="000000100000" w:firstRow="0" w:lastRow="0" w:firstColumn="0" w:lastColumn="0" w:oddVBand="0" w:evenVBand="0" w:oddHBand="1" w:evenHBand="0" w:firstRowFirstColumn="0" w:firstRowLastColumn="0" w:lastRowFirstColumn="0" w:lastRowLastColumn="0"/>
+            </w:pPr>
+            <w:r>
+              <w:t>696</w:t>
+            </w:r>
+          </w:p>
+        </w:tc>
+        <w:tc>
+          <w:tcPr>
+            <w:tcW w:w="0" w:type="auto"/>
+            <w:hideMark/>
+          </w:tcPr>
+          <w:p>
+            <w:pPr>
+              <w:spacing w:after="160" w:line="278" w:lineRule="auto"/>
+              <w:cnfStyle w:val="000000100000" w:firstRow="0" w:lastRow="0" w:firstColumn="0" w:lastColumn="0" w:oddVBand="0" w:evenVBand="0" w:oddHBand="1" w:evenHBand="0" w:firstRowFirstColumn="0" w:firstRowLastColumn="0" w:lastRowFirstColumn="0" w:lastRowLastColumn="0"/>
+            </w:pPr>
+            <w:r>
+              <w:t>Gouvernance + conformité réglementaire</w:t>
+            </w:r>
+          </w:p>
+        </w:tc>
+      </w:tr>
+    </w:tbl>
+    <w:p>
+      <w:r>
+        <w:t xml:space="preserve">L'environnement est maintenant évalué simultanément sur </w:t>
+      </w:r>
+      <w:r>
+        <w:rPr>
+          <w:b/>
+          <w:bCs/>
+        </w:rPr>
+        <w:t>3 frameworks</w:t>
+      </w:r>
+      <w:r>
+        <w:t xml:space="preserve"> — c'est exactement ce qu'un auditeur cloud fait lors d'une mission. Le tableau de bord Conformité réglementaire montre en temps réel l'écart entre l'état actuel et chaque standard.</w:t>
+      </w:r>
+    </w:p>
+    <w:p/>
+    <w:p>
+      <w:pPr>
+        <w:rPr>
+          <w:b/>
+          <w:bCs/>
+        </w:rPr>
+      </w:pPr>
+      <w:r>
+        <w:rPr>
+          <w:b/>
+          <w:bCs/>
+        </w:rPr>
+        <w:t>Maintenant — voir les résultats</w:t>
+      </w:r>
+    </w:p>
+    <w:p>
+      <w:r>
+        <w:t>portal.azure.com (FR)</w:t>
+      </w:r>
+    </w:p>
+    <w:p>
+      <w:r>
+        <w:t>→ Microsoft Defender pour le cloud</w:t>
+      </w:r>
+    </w:p>
+    <w:p>
+      <w:r>
+        <w:t>→ Conformité réglementaire (menu gauche, sous "Cloud Security")</w:t>
+      </w:r>
+    </w:p>
+    <w:p>
+      <w:r>
+        <w:rPr>
+          <w:noProof/>
+        </w:rPr>
+        <w:drawing>
+          <wp:inline distT="0" distB="0" distL="0" distR="0" wp14:anchorId="52BEE736" wp14:editId="273AA7AF">
+            <wp:extent cx="5760720" cy="2656205"/>
+            <wp:effectExtent l="0" t="0" r="0" b="0"/>
+            <wp:docPr id="38971837" name="Image 1"/>
+            <wp:cNvGraphicFramePr>
+              <a:graphicFrameLocks xmlns:a="http://schemas.openxmlformats.org/drawingml/2006/main" noChangeAspect="1"/>
+            </wp:cNvGraphicFramePr>
+            <a:graphic xmlns:a="http://schemas.openxmlformats.org/drawingml/2006/main">
+              <a:graphicData uri="http://schemas.openxmlformats.org/drawingml/2006/picture">
+                <pic:pic xmlns:pic="http://schemas.openxmlformats.org/drawingml/2006/picture">
+                  <pic:nvPicPr>
+                    <pic:cNvPr id="38971837" name=""/>
+                    <pic:cNvPicPr/>
+                  </pic:nvPicPr>
+                  <pic:blipFill>
+                    <a:blip r:embed="rId64"/>
+                    <a:stretch>
+                      <a:fillRect/>
+                    </a:stretch>
+                  </pic:blipFill>
+                  <pic:spPr>
+                    <a:xfrm>
+                      <a:off x="0" y="0"/>
+                      <a:ext cx="5760720" cy="2656205"/>
+                    </a:xfrm>
+                    <a:prstGeom prst="rect">
+                      <a:avLst/>
+                    </a:prstGeom>
+                  </pic:spPr>
+                </pic:pic>
+              </a:graphicData>
+            </a:graphic>
+          </wp:inline>
+        </w:drawing>
+      </w:r>
+    </w:p>
+    <w:p>
+      <w:r>
+        <w:rPr>
+          <w:b/>
+          <w:bCs/>
+        </w:rPr>
+        <w:t>Excellent — le tableau de bord Conformité réglementaire est là !</w:t>
+      </w:r>
+    </w:p>
+    <w:p>
+      <w:r>
+        <w:t>Ce qu'on voit :</w:t>
+      </w:r>
+    </w:p>
+    <w:tbl>
+      <w:tblPr>
+        <w:tblStyle w:val="TableauGrille5Fonc-Accentuation2"/>
+        <w:tblW w:w="0" w:type="auto"/>
+        <w:tblLook w:val="04A0" w:firstRow="1" w:lastRow="0" w:firstColumn="1" w:lastColumn="0" w:noHBand="0" w:noVBand="1"/>
+      </w:tblPr>
+      <w:tblGrid>
+        <w:gridCol w:w="4008"/>
+        <w:gridCol w:w="2675"/>
+        <w:gridCol w:w="2379"/>
+      </w:tblGrid>
+      <w:tr>
+        <w:trPr>
+          <w:cnfStyle w:val="100000000000" w:firstRow="1" w:lastRow="0" w:firstColumn="0" w:lastColumn="0" w:oddVBand="0" w:evenVBand="0" w:oddHBand="0" w:evenHBand="0" w:firstRowFirstColumn="0" w:firstRowLastColumn="0" w:lastRowFirstColumn="0" w:lastRowLastColumn="0"/>
+        </w:trPr>
+        <w:tc>
+          <w:tcPr>
+            <w:cnfStyle w:val="001000000000" w:firstRow="0" w:lastRow="0" w:firstColumn="1" w:lastColumn="0" w:oddVBand="0" w:evenVBand="0" w:oddHBand="0" w:evenHBand="0" w:firstRowFirstColumn="0" w:firstRowLastColumn="0" w:lastRowFirstColumn="0" w:lastRowLastColumn="0"/>
+            <w:tcW w:w="0" w:type="auto"/>
+            <w:hideMark/>
+          </w:tcPr>
+          <w:p>
+            <w:pPr>
+              <w:spacing w:after="160" w:line="278" w:lineRule="auto"/>
+            </w:pPr>
+            <w:r>
+              <w:t>Framework</w:t>
+            </w:r>
+          </w:p>
+        </w:tc>
+        <w:tc>
+          <w:tcPr>
+            <w:tcW w:w="0" w:type="auto"/>
+            <w:hideMark/>
+          </w:tcPr>
+          <w:p>
+            <w:pPr>
+              <w:spacing w:after="160" w:line="278" w:lineRule="auto"/>
+              <w:cnfStyle w:val="100000000000" w:firstRow="1" w:lastRow="0" w:firstColumn="0" w:lastColumn="0" w:oddVBand="0" w:evenVBand="0" w:oddHBand="0" w:evenHBand="0" w:firstRowFirstColumn="0" w:firstRowLastColumn="0" w:lastRowFirstColumn="0" w:lastRowLastColumn="0"/>
+            </w:pPr>
+            <w:r>
+              <w:t>Score actuel</w:t>
+            </w:r>
+          </w:p>
+        </w:tc>
+        <w:tc>
+          <w:tcPr>
+            <w:tcW w:w="0" w:type="auto"/>
+            <w:hideMark/>
+          </w:tcPr>
+          <w:p>
+            <w:pPr>
+              <w:spacing w:after="160" w:line="278" w:lineRule="auto"/>
+              <w:cnfStyle w:val="100000000000" w:firstRow="1" w:lastRow="0" w:firstColumn="0" w:lastColumn="0" w:oddVBand="0" w:evenVBand="0" w:oddHBand="0" w:evenHBand="0" w:firstRowFirstColumn="0" w:firstRowLastColumn="0" w:lastRowFirstColumn="0" w:lastRowLastColumn="0"/>
+            </w:pPr>
+            <w:r>
+              <w:t>Note</w:t>
+            </w:r>
+          </w:p>
+        </w:tc>
+      </w:tr>
+      <w:tr>
+        <w:trPr>
+          <w:cnfStyle w:val="000000100000" w:firstRow="0" w:lastRow="0" w:firstColumn="0" w:lastColumn="0" w:oddVBand="0" w:evenVBand="0" w:oddHBand="1" w:evenHBand="0" w:firstRowFirstColumn="0" w:firstRowLastColumn="0" w:lastRowFirstColumn="0" w:lastRowLastColumn="0"/>
+        </w:trPr>
+        <w:tc>
+          <w:tcPr>
+            <w:cnfStyle w:val="001000000000" w:firstRow="0" w:lastRow="0" w:firstColumn="1" w:lastColumn="0" w:oddVBand="0" w:evenVBand="0" w:oddHBand="0" w:evenHBand="0" w:firstRowFirstColumn="0" w:firstRowLastColumn="0" w:lastRowFirstColumn="0" w:lastRowLastColumn="0"/>
+            <w:tcW w:w="0" w:type="auto"/>
+            <w:hideMark/>
+          </w:tcPr>
+          <w:p>
+            <w:pPr>
+              <w:spacing w:after="160" w:line="278" w:lineRule="auto"/>
+            </w:pPr>
+            <w:r>
+              <w:t>Microsoft cloud security benchmark</w:t>
+            </w:r>
+          </w:p>
+        </w:tc>
+        <w:tc>
+          <w:tcPr>
+            <w:tcW w:w="0" w:type="auto"/>
+            <w:hideMark/>
+          </w:tcPr>
+          <w:p>
+            <w:pPr>
+              <w:spacing w:after="160" w:line="278" w:lineRule="auto"/>
+              <w:cnfStyle w:val="000000100000" w:firstRow="0" w:lastRow="0" w:firstColumn="0" w:lastColumn="0" w:oddVBand="0" w:evenVBand="0" w:oddHBand="1" w:evenHBand="0" w:firstRowFirstColumn="0" w:firstRowLastColumn="0" w:lastRowFirstColumn="0" w:lastRowLastColumn="0"/>
+            </w:pPr>
+            <w:r>
+              <w:rPr>
+                <w:b/>
+                <w:bCs/>
+              </w:rPr>
+              <w:t>49/63 contrôles réussis</w:t>
+            </w:r>
+          </w:p>
+        </w:tc>
+        <w:tc>
+          <w:tcPr>
+            <w:tcW w:w="0" w:type="auto"/>
+            <w:hideMark/>
+          </w:tcPr>
+          <w:p>
+            <w:pPr>
+              <w:spacing w:after="160" w:line="278" w:lineRule="auto"/>
+              <w:cnfStyle w:val="000000100000" w:firstRow="0" w:lastRow="0" w:firstColumn="0" w:lastColumn="0" w:oddVBand="0" w:evenVBand="0" w:oddHBand="1" w:evenHBand="0" w:firstRowFirstColumn="0" w:firstRowLastColumn="0" w:lastRowFirstColumn="0" w:lastRowLastColumn="0"/>
+            </w:pPr>
+            <w:r>
+              <w:rPr>
+                <w:rFonts w:ascii="Segoe UI Emoji" w:hAnsi="Segoe UI Emoji" w:cs="Segoe UI Emoji"/>
+              </w:rPr>
+              <w:t>✅</w:t>
+            </w:r>
+            <w:r>
+              <w:t xml:space="preserve"> Déjà évalué</w:t>
+            </w:r>
+          </w:p>
+        </w:tc>
+      </w:tr>
+      <w:tr>
+        <w:tc>
+          <w:tcPr>
+            <w:cnfStyle w:val="001000000000" w:firstRow="0" w:lastRow="0" w:firstColumn="1" w:lastColumn="0" w:oddVBand="0" w:evenVBand="0" w:oddHBand="0" w:evenHBand="0" w:firstRowFirstColumn="0" w:firstRowLastColumn="0" w:lastRowFirstColumn="0" w:lastRowLastColumn="0"/>
+            <w:tcW w:w="0" w:type="auto"/>
+            <w:hideMark/>
+          </w:tcPr>
+          <w:p>
+            <w:pPr>
+              <w:spacing w:after="160" w:line="278" w:lineRule="auto"/>
+            </w:pPr>
+            <w:r>
+              <w:lastRenderedPageBreak/>
+              <w:t>Azure CSPM</w:t>
+            </w:r>
+          </w:p>
+        </w:tc>
+        <w:tc>
+          <w:tcPr>
+            <w:tcW w:w="0" w:type="auto"/>
+            <w:hideMark/>
+          </w:tcPr>
+          <w:p>
+            <w:pPr>
+              <w:spacing w:after="160" w:line="278" w:lineRule="auto"/>
+              <w:cnfStyle w:val="000000000000" w:firstRow="0" w:lastRow="0" w:firstColumn="0" w:lastColumn="0" w:oddVBand="0" w:evenVBand="0" w:oddHBand="0" w:evenHBand="0" w:firstRowFirstColumn="0" w:firstRowLastColumn="0" w:lastRowFirstColumn="0" w:lastRowLastColumn="0"/>
+            </w:pPr>
+            <w:r>
+              <w:t>0/1</w:t>
+            </w:r>
+          </w:p>
+        </w:tc>
+        <w:tc>
+          <w:tcPr>
+            <w:tcW w:w="0" w:type="auto"/>
+            <w:hideMark/>
+          </w:tcPr>
+          <w:p>
+            <w:pPr>
+              <w:spacing w:after="160" w:line="278" w:lineRule="auto"/>
+              <w:cnfStyle w:val="000000000000" w:firstRow="0" w:lastRow="0" w:firstColumn="0" w:lastColumn="0" w:oddVBand="0" w:evenVBand="0" w:oddHBand="0" w:evenHBand="0" w:firstRowFirstColumn="0" w:firstRowLastColumn="0" w:lastRowFirstColumn="0" w:lastRowLastColumn="0"/>
+            </w:pPr>
+            <w:r>
+              <w:t>En cours d'évaluation</w:t>
+            </w:r>
+          </w:p>
+        </w:tc>
+      </w:tr>
+    </w:tbl>
+    <w:p>
+      <w:r>
+        <w:rPr>
+          <w:b/>
+          <w:bCs/>
+        </w:rPr>
+        <w:t>CIS et NIST n'apparaissent pas encore</w:t>
+      </w:r>
+      <w:r>
+        <w:t xml:space="preserve"> — normal, ils viennent d'être activés. L'évaluation prend 15-30 min. Ils apparaîtront automatiquement dans les onglets en bas.</w:t>
+      </w:r>
+    </w:p>
+    <w:p/>
+    <w:p>
+      <w:r>
+        <w:rPr>
+          <w:b/>
+          <w:bCs/>
+        </w:rPr>
+        <w:t>Phase 06 — Regulatory Compliance — Résultats</w:t>
+      </w:r>
+    </w:p>
+    <w:p>
+      <w:r>
+        <w:rPr>
+          <w:b/>
+          <w:bCs/>
+        </w:rPr>
+        <w:t>Frameworks activés</w:t>
+      </w:r>
+    </w:p>
+    <w:p>
+      <w:pPr>
+        <w:numPr>
+          <w:ilvl w:val="0"/>
+          <w:numId w:val="7"/>
+        </w:numPr>
+      </w:pPr>
+      <w:r>
+        <w:t>Microsoft Cloud Security Benchmark (par défaut)</w:t>
+      </w:r>
+    </w:p>
+    <w:p>
+      <w:pPr>
+        <w:numPr>
+          <w:ilvl w:val="0"/>
+          <w:numId w:val="7"/>
+        </w:numPr>
+      </w:pPr>
+      <w:r>
+        <w:t>CIS Microsoft Azure Foundations Benchmark v2.0.0 (activé manuellement)</w:t>
+      </w:r>
+    </w:p>
+    <w:p>
+      <w:pPr>
+        <w:numPr>
+          <w:ilvl w:val="0"/>
+          <w:numId w:val="7"/>
+        </w:numPr>
+      </w:pPr>
+      <w:r>
+        <w:t>NIST SP 800-53 Rev. 5 (activé manuellement)</w:t>
+      </w:r>
+    </w:p>
+    <w:p>
+      <w:r>
+        <w:rPr>
+          <w:b/>
+          <w:bCs/>
+        </w:rPr>
+        <w:t>Scores au moment de l'activation</w:t>
+      </w:r>
+    </w:p>
+    <w:tbl>
+      <w:tblPr>
+        <w:tblStyle w:val="TableauGrille5Fonc-Accentuation2"/>
+        <w:tblW w:w="0" w:type="auto"/>
+        <w:tblLook w:val="04A0" w:firstRow="1" w:lastRow="0" w:firstColumn="1" w:lastColumn="0" w:noHBand="0" w:noVBand="1"/>
+      </w:tblPr>
+      <w:tblGrid>
+        <w:gridCol w:w="3943"/>
+        <w:gridCol w:w="2052"/>
+        <w:gridCol w:w="3067"/>
+      </w:tblGrid>
+      <w:tr>
+        <w:trPr>
+          <w:cnfStyle w:val="100000000000" w:firstRow="1" w:lastRow="0" w:firstColumn="0" w:lastColumn="0" w:oddVBand="0" w:evenVBand="0" w:oddHBand="0" w:evenHBand="0" w:firstRowFirstColumn="0" w:firstRowLastColumn="0" w:lastRowFirstColumn="0" w:lastRowLastColumn="0"/>
+        </w:trPr>
+        <w:tc>
+          <w:tcPr>
+            <w:cnfStyle w:val="001000000000" w:firstRow="0" w:lastRow="0" w:firstColumn="1" w:lastColumn="0" w:oddVBand="0" w:evenVBand="0" w:oddHBand="0" w:evenHBand="0" w:firstRowFirstColumn="0" w:firstRowLastColumn="0" w:lastRowFirstColumn="0" w:lastRowLastColumn="0"/>
+            <w:tcW w:w="0" w:type="auto"/>
+            <w:hideMark/>
+          </w:tcPr>
+          <w:p>
+            <w:pPr>
+              <w:spacing w:after="160" w:line="278" w:lineRule="auto"/>
+            </w:pPr>
+            <w:r>
+              <w:t>Framework</w:t>
+            </w:r>
+          </w:p>
+        </w:tc>
+        <w:tc>
+          <w:tcPr>
+            <w:tcW w:w="0" w:type="auto"/>
+            <w:hideMark/>
+          </w:tcPr>
+          <w:p>
+            <w:pPr>
+              <w:spacing w:after="160" w:line="278" w:lineRule="auto"/>
+              <w:cnfStyle w:val="100000000000" w:firstRow="1" w:lastRow="0" w:firstColumn="0" w:lastColumn="0" w:oddVBand="0" w:evenVBand="0" w:oddHBand="0" w:evenHBand="0" w:firstRowFirstColumn="0" w:firstRowLastColumn="0" w:lastRowFirstColumn="0" w:lastRowLastColumn="0"/>
+            </w:pPr>
+            <w:r>
+              <w:t>Contrôles réussis</w:t>
+            </w:r>
+          </w:p>
+        </w:tc>
+        <w:tc>
+          <w:tcPr>
+            <w:tcW w:w="0" w:type="auto"/>
+            <w:hideMark/>
+          </w:tcPr>
+          <w:p>
+            <w:pPr>
+              <w:spacing w:after="160" w:line="278" w:lineRule="auto"/>
+              <w:cnfStyle w:val="100000000000" w:firstRow="1" w:lastRow="0" w:firstColumn="0" w:lastColumn="0" w:oddVBand="0" w:evenVBand="0" w:oddHBand="0" w:evenHBand="0" w:firstRowFirstColumn="0" w:firstRowLastColumn="0" w:lastRowFirstColumn="0" w:lastRowLastColumn="0"/>
+            </w:pPr>
+            <w:r>
+              <w:t>Statut</w:t>
+            </w:r>
+          </w:p>
+        </w:tc>
+      </w:tr>
+      <w:tr>
+        <w:trPr>
+          <w:cnfStyle w:val="000000100000" w:firstRow="0" w:lastRow="0" w:firstColumn="0" w:lastColumn="0" w:oddVBand="0" w:evenVBand="0" w:oddHBand="1" w:evenHBand="0" w:firstRowFirstColumn="0" w:firstRowLastColumn="0" w:lastRowFirstColumn="0" w:lastRowLastColumn="0"/>
+        </w:trPr>
+        <w:tc>
+          <w:tcPr>
+            <w:cnfStyle w:val="001000000000" w:firstRow="0" w:lastRow="0" w:firstColumn="1" w:lastColumn="0" w:oddVBand="0" w:evenVBand="0" w:oddHBand="0" w:evenHBand="0" w:firstRowFirstColumn="0" w:firstRowLastColumn="0" w:lastRowFirstColumn="0" w:lastRowLastColumn="0"/>
+            <w:tcW w:w="0" w:type="auto"/>
+            <w:hideMark/>
+          </w:tcPr>
+          <w:p>
+            <w:pPr>
+              <w:spacing w:after="160" w:line="278" w:lineRule="auto"/>
+            </w:pPr>
+            <w:r>
+              <w:t>Microsoft Cloud Security Benchmark</w:t>
+            </w:r>
+          </w:p>
+        </w:tc>
+        <w:tc>
+          <w:tcPr>
+            <w:tcW w:w="0" w:type="auto"/>
+            <w:hideMark/>
+          </w:tcPr>
+          <w:p>
+            <w:pPr>
+              <w:spacing w:after="160" w:line="278" w:lineRule="auto"/>
+              <w:cnfStyle w:val="000000100000" w:firstRow="0" w:lastRow="0" w:firstColumn="0" w:lastColumn="0" w:oddVBand="0" w:evenVBand="0" w:oddHBand="1" w:evenHBand="0" w:firstRowFirstColumn="0" w:firstRowLastColumn="0" w:lastRowFirstColumn="0" w:lastRowLastColumn="0"/>
+            </w:pPr>
+            <w:r>
+              <w:t>49/63 (77,7%)</w:t>
+            </w:r>
+          </w:p>
+        </w:tc>
+        <w:tc>
+          <w:tcPr>
+            <w:tcW w:w="0" w:type="auto"/>
+            <w:hideMark/>
+          </w:tcPr>
+          <w:p>
+            <w:pPr>
+              <w:spacing w:after="160" w:line="278" w:lineRule="auto"/>
+              <w:cnfStyle w:val="000000100000" w:firstRow="0" w:lastRow="0" w:firstColumn="0" w:lastColumn="0" w:oddVBand="0" w:evenVBand="0" w:oddHBand="1" w:evenHBand="0" w:firstRowFirstColumn="0" w:firstRowLastColumn="0" w:lastRowFirstColumn="0" w:lastRowLastColumn="0"/>
+            </w:pPr>
+            <w:r>
+              <w:rPr>
+                <w:rFonts w:ascii="Segoe UI Emoji" w:hAnsi="Segoe UI Emoji" w:cs="Segoe UI Emoji"/>
+              </w:rPr>
+              <w:t>✅</w:t>
+            </w:r>
+            <w:r>
+              <w:t xml:space="preserve"> Évalué</w:t>
+            </w:r>
+          </w:p>
+        </w:tc>
+      </w:tr>
+      <w:tr>
+        <w:tc>
+          <w:tcPr>
+            <w:cnfStyle w:val="001000000000" w:firstRow="0" w:lastRow="0" w:firstColumn="1" w:lastColumn="0" w:oddVBand="0" w:evenVBand="0" w:oddHBand="0" w:evenHBand="0" w:firstRowFirstColumn="0" w:firstRowLastColumn="0" w:lastRowFirstColumn="0" w:lastRowLastColumn="0"/>
+            <w:tcW w:w="0" w:type="auto"/>
+            <w:hideMark/>
+          </w:tcPr>
+          <w:p>
+            <w:pPr>
+              <w:spacing w:after="160" w:line="278" w:lineRule="auto"/>
+            </w:pPr>
+            <w:r>
+              <w:t>Azure CSPM</w:t>
+            </w:r>
+          </w:p>
+        </w:tc>
+        <w:tc>
+          <w:tcPr>
+            <w:tcW w:w="0" w:type="auto"/>
+            <w:hideMark/>
+          </w:tcPr>
+          <w:p>
+            <w:pPr>
+              <w:spacing w:after="160" w:line="278" w:lineRule="auto"/>
+              <w:cnfStyle w:val="000000000000" w:firstRow="0" w:lastRow="0" w:firstColumn="0" w:lastColumn="0" w:oddVBand="0" w:evenVBand="0" w:oddHBand="0" w:evenHBand="0" w:firstRowFirstColumn="0" w:firstRowLastColumn="0" w:lastRowFirstColumn="0" w:lastRowLastColumn="0"/>
+            </w:pPr>
+            <w:r>
+              <w:t>0/1</w:t>
+            </w:r>
+          </w:p>
+        </w:tc>
+        <w:tc>
+          <w:tcPr>
+            <w:tcW w:w="0" w:type="auto"/>
+            <w:hideMark/>
+          </w:tcPr>
+          <w:p>
+            <w:pPr>
+              <w:spacing w:after="160" w:line="278" w:lineRule="auto"/>
+              <w:cnfStyle w:val="000000000000" w:firstRow="0" w:lastRow="0" w:firstColumn="0" w:lastColumn="0" w:oddVBand="0" w:evenVBand="0" w:oddHBand="0" w:evenHBand="0" w:firstRowFirstColumn="0" w:firstRowLastColumn="0" w:lastRowFirstColumn="0" w:lastRowLastColumn="0"/>
+            </w:pPr>
+            <w:r>
+              <w:t>En évaluation</w:t>
+            </w:r>
+          </w:p>
+        </w:tc>
+      </w:tr>
+      <w:tr>
+        <w:trPr>
+          <w:cnfStyle w:val="000000100000" w:firstRow="0" w:lastRow="0" w:firstColumn="0" w:lastColumn="0" w:oddVBand="0" w:evenVBand="0" w:oddHBand="1" w:evenHBand="0" w:firstRowFirstColumn="0" w:firstRowLastColumn="0" w:lastRowFirstColumn="0" w:lastRowLastColumn="0"/>
+        </w:trPr>
+        <w:tc>
+          <w:tcPr>
+            <w:cnfStyle w:val="001000000000" w:firstRow="0" w:lastRow="0" w:firstColumn="1" w:lastColumn="0" w:oddVBand="0" w:evenVBand="0" w:oddHBand="0" w:evenHBand="0" w:firstRowFirstColumn="0" w:firstRowLastColumn="0" w:lastRowFirstColumn="0" w:lastRowLastColumn="0"/>
+            <w:tcW w:w="0" w:type="auto"/>
+            <w:hideMark/>
+          </w:tcPr>
+          <w:p>
+            <w:pPr>
+              <w:spacing w:after="160" w:line="278" w:lineRule="auto"/>
+            </w:pPr>
+            <w:r>
+              <w:t>CIS Azure v2.0.0</w:t>
+            </w:r>
+          </w:p>
+        </w:tc>
+        <w:tc>
+          <w:tcPr>
+            <w:tcW w:w="0" w:type="auto"/>
+            <w:hideMark/>
+          </w:tcPr>
+          <w:p>
+            <w:pPr>
+              <w:spacing w:after="160" w:line="278" w:lineRule="auto"/>
+              <w:cnfStyle w:val="000000100000" w:firstRow="0" w:lastRow="0" w:firstColumn="0" w:lastColumn="0" w:oddVBand="0" w:evenVBand="0" w:oddHBand="1" w:evenHBand="0" w:firstRowFirstColumn="0" w:firstRowLastColumn="0" w:lastRowFirstColumn="0" w:lastRowLastColumn="0"/>
+            </w:pPr>
+            <w:r>
+              <w:t>En attente</w:t>
+            </w:r>
+          </w:p>
+        </w:tc>
+        <w:tc>
+          <w:tcPr>
+            <w:tcW w:w="0" w:type="auto"/>
+            <w:hideMark/>
+          </w:tcPr>
+          <w:p>
+            <w:pPr>
+              <w:spacing w:after="160" w:line="278" w:lineRule="auto"/>
+              <w:cnfStyle w:val="000000100000" w:firstRow="0" w:lastRow="0" w:firstColumn="0" w:lastColumn="0" w:oddVBand="0" w:evenVBand="0" w:oddHBand="1" w:evenHBand="0" w:firstRowFirstColumn="0" w:firstRowLastColumn="0" w:lastRowFirstColumn="0" w:lastRowLastColumn="0"/>
+            </w:pPr>
+            <w:r>
+              <w:t>Évaluation en cours (~30 min)</w:t>
+            </w:r>
+          </w:p>
+        </w:tc>
+      </w:tr>
+      <w:tr>
+        <w:tc>
+          <w:tcPr>
+            <w:cnfStyle w:val="001000000000" w:firstRow="0" w:lastRow="0" w:firstColumn="1" w:lastColumn="0" w:oddVBand="0" w:evenVBand="0" w:oddHBand="0" w:evenHBand="0" w:firstRowFirstColumn="0" w:firstRowLastColumn="0" w:lastRowFirstColumn="0" w:lastRowLastColumn="0"/>
+            <w:tcW w:w="0" w:type="auto"/>
+            <w:hideMark/>
+          </w:tcPr>
+          <w:p>
+            <w:pPr>
+              <w:spacing w:after="160" w:line="278" w:lineRule="auto"/>
+            </w:pPr>
+            <w:r>
+              <w:t>NIST SP 800-53 Rev. 5</w:t>
+            </w:r>
+          </w:p>
+        </w:tc>
+        <w:tc>
+          <w:tcPr>
+            <w:tcW w:w="0" w:type="auto"/>
+            <w:hideMark/>
+          </w:tcPr>
+          <w:p>
+            <w:pPr>
+              <w:spacing w:after="160" w:line="278" w:lineRule="auto"/>
+              <w:cnfStyle w:val="000000000000" w:firstRow="0" w:lastRow="0" w:firstColumn="0" w:lastColumn="0" w:oddVBand="0" w:evenVBand="0" w:oddHBand="0" w:evenHBand="0" w:firstRowFirstColumn="0" w:firstRowLastColumn="0" w:lastRowFirstColumn="0" w:lastRowLastColumn="0"/>
+            </w:pPr>
+            <w:r>
+              <w:t>En attente</w:t>
+            </w:r>
+          </w:p>
+        </w:tc>
+        <w:tc>
+          <w:tcPr>
+            <w:tcW w:w="0" w:type="auto"/>
+            <w:hideMark/>
+          </w:tcPr>
+          <w:p>
+            <w:pPr>
+              <w:spacing w:after="160" w:line="278" w:lineRule="auto"/>
+              <w:cnfStyle w:val="000000000000" w:firstRow="0" w:lastRow="0" w:firstColumn="0" w:lastColumn="0" w:oddVBand="0" w:evenVBand="0" w:oddHBand="0" w:evenHBand="0" w:firstRowFirstColumn="0" w:firstRowLastColumn="0" w:lastRowFirstColumn="0" w:lastRowLastColumn="0"/>
+            </w:pPr>
+            <w:r>
+              <w:t>Évaluation en cours (~30 min)</w:t>
+            </w:r>
+          </w:p>
+        </w:tc>
+      </w:tr>
+    </w:tbl>
+    <w:p>
+      <w:r>
+        <w:rPr>
+          <w:b/>
+          <w:bCs/>
+        </w:rPr>
+        <w:t>Note</w:t>
+      </w:r>
+      <w:r>
+        <w:t xml:space="preserve"> : Les frameworks CIS et NIST nécessitent 15-30 min d'évaluation après activation. Les scores complets seront documentés après le rafraîchissement.</w:t>
+      </w:r>
+    </w:p>
+    <w:p/>
+    <w:p>
+      <w:r>
+        <w:t>Commit Phase 06</w:t>
+      </w:r>
+    </w:p>
+    <w:p>
+      <w:r>
+        <w:t>cd "D:\personnel-ivan\PROJETS-PERSO-LAB\Microsoft Defender for Cloud"</w:t>
+      </w:r>
+    </w:p>
+    <w:p>
+      <w:r>
+        <w:t>git add -A</w:t>
+      </w:r>
+    </w:p>
+    <w:p>
+      <w:r>
+        <w:t>git commit -m "feat(phase-06): regulatory compliance - frameworks actives</w:t>
+      </w:r>
+    </w:p>
+    <w:p>
+      <w:r>
+        <w:t>- CIS Microsoft Azure Foundations Benchmark v2.0.0 : active</w:t>
+      </w:r>
+    </w:p>
+    <w:p>
+      <w:r>
+        <w:t>- NIST SP 800-53 Rev. 5 : active</w:t>
+      </w:r>
+    </w:p>
+    <w:p>
+      <w:r>
+        <w:lastRenderedPageBreak/>
+        <w:t>- Microsoft Cloud Security Benchmark : 49/63 controles reussis (77.7%)</w:t>
+      </w:r>
+    </w:p>
+    <w:p>
+      <w:r>
+        <w:t>- CIS + NIST en cours d evaluation (15-30 min)</w:t>
+      </w:r>
+    </w:p>
+    <w:p>
+      <w:r>
+        <w:t>- Screenshot : assets/screenshots/phase-06-compliance.png"</w:t>
+      </w:r>
+    </w:p>
+    <w:p>
+      <w:r>
+        <w:t>git push</w:t>
+      </w:r>
+    </w:p>
+    <w:p>
+      <w:r>
+        <w:rPr>
+          <w:noProof/>
+        </w:rPr>
+        <w:drawing>
+          <wp:inline distT="0" distB="0" distL="0" distR="0" wp14:anchorId="630A1C0F" wp14:editId="20587A0B">
+            <wp:extent cx="5760720" cy="2665095"/>
+            <wp:effectExtent l="0" t="0" r="0" b="1905"/>
+            <wp:docPr id="2030052264" name="Image 1"/>
+            <wp:cNvGraphicFramePr>
+              <a:graphicFrameLocks xmlns:a="http://schemas.openxmlformats.org/drawingml/2006/main" noChangeAspect="1"/>
+            </wp:cNvGraphicFramePr>
+            <a:graphic xmlns:a="http://schemas.openxmlformats.org/drawingml/2006/main">
+              <a:graphicData uri="http://schemas.openxmlformats.org/drawingml/2006/picture">
+                <pic:pic xmlns:pic="http://schemas.openxmlformats.org/drawingml/2006/picture">
+                  <pic:nvPicPr>
+                    <pic:cNvPr id="2030052264" name=""/>
+                    <pic:cNvPicPr/>
+                  </pic:nvPicPr>
+                  <pic:blipFill>
+                    <a:blip r:embed="rId65"/>
+                    <a:stretch>
+                      <a:fillRect/>
+                    </a:stretch>
+                  </pic:blipFill>
+                  <pic:spPr>
+                    <a:xfrm>
+                      <a:off x="0" y="0"/>
+                      <a:ext cx="5760720" cy="2665095"/>
+                    </a:xfrm>
+                    <a:prstGeom prst="rect">
+                      <a:avLst/>
+                    </a:prstGeom>
+                  </pic:spPr>
+                </pic:pic>
+              </a:graphicData>
+            </a:graphic>
+          </wp:inline>
+        </w:drawing>
+      </w:r>
+    </w:p>
+    <w:p/>
+    <w:p/>
     <w:sectPr>
       <w:pgSz w:w="11906" w:h="16838"/>
       <w:pgMar w:top="1417" w:right="1417" w:bottom="1417" w:left="1417" w:header="708" w:footer="708" w:gutter="0"/>
@@ -8124,122 +9735,9 @@
     </w:lvl>
   </w:abstractNum>
   <w:abstractNum w:abstractNumId="2" w15:restartNumberingAfterBreak="0">
-    <w:nsid w:val="364C3DB7"/>
+    <w:nsid w:val="34CC432F"/>
     <w:multiLevelType w:val="multilevel"/>
-    <w:tmpl w:val="BC76B22E"/>
-    <w:lvl w:ilvl="0">
-      <w:start w:val="1"/>
-      <w:numFmt w:val="decimal"/>
-      <w:lvlText w:val="%1."/>
-      <w:lvlJc w:val="left"/>
-      <w:pPr>
-        <w:tabs>
-          <w:tab w:val="num" w:pos="720"/>
-        </w:tabs>
-        <w:ind w:left="720" w:hanging="360"/>
-      </w:pPr>
-    </w:lvl>
-    <w:lvl w:ilvl="1" w:tentative="1">
-      <w:start w:val="1"/>
-      <w:numFmt w:val="decimal"/>
-      <w:lvlText w:val="%2."/>
-      <w:lvlJc w:val="left"/>
-      <w:pPr>
-        <w:tabs>
-          <w:tab w:val="num" w:pos="1440"/>
-        </w:tabs>
-        <w:ind w:left="1440" w:hanging="360"/>
-      </w:pPr>
-    </w:lvl>
-    <w:lvl w:ilvl="2" w:tentative="1">
-      <w:start w:val="1"/>
-      <w:numFmt w:val="decimal"/>
-      <w:lvlText w:val="%3."/>
-      <w:lvlJc w:val="left"/>
-      <w:pPr>
-        <w:tabs>
-          <w:tab w:val="num" w:pos="2160"/>
-        </w:tabs>
-        <w:ind w:left="2160" w:hanging="360"/>
-      </w:pPr>
-    </w:lvl>
-    <w:lvl w:ilvl="3" w:tentative="1">
-      <w:start w:val="1"/>
-      <w:numFmt w:val="decimal"/>
-      <w:lvlText w:val="%4."/>
-      <w:lvlJc w:val="left"/>
-      <w:pPr>
-        <w:tabs>
-          <w:tab w:val="num" w:pos="2880"/>
-        </w:tabs>
-        <w:ind w:left="2880" w:hanging="360"/>
-      </w:pPr>
-    </w:lvl>
-    <w:lvl w:ilvl="4" w:tentative="1">
-      <w:start w:val="1"/>
-      <w:numFmt w:val="decimal"/>
-      <w:lvlText w:val="%5."/>
-      <w:lvlJc w:val="left"/>
-      <w:pPr>
-        <w:tabs>
-          <w:tab w:val="num" w:pos="3600"/>
-        </w:tabs>
-        <w:ind w:left="3600" w:hanging="360"/>
-      </w:pPr>
-    </w:lvl>
-    <w:lvl w:ilvl="5" w:tentative="1">
-      <w:start w:val="1"/>
-      <w:numFmt w:val="decimal"/>
-      <w:lvlText w:val="%6."/>
-      <w:lvlJc w:val="left"/>
-      <w:pPr>
-        <w:tabs>
-          <w:tab w:val="num" w:pos="4320"/>
-        </w:tabs>
-        <w:ind w:left="4320" w:hanging="360"/>
-      </w:pPr>
-    </w:lvl>
-    <w:lvl w:ilvl="6" w:tentative="1">
-      <w:start w:val="1"/>
-      <w:numFmt w:val="decimal"/>
-      <w:lvlText w:val="%7."/>
-      <w:lvlJc w:val="left"/>
-      <w:pPr>
-        <w:tabs>
-          <w:tab w:val="num" w:pos="5040"/>
-        </w:tabs>
-        <w:ind w:left="5040" w:hanging="360"/>
-      </w:pPr>
-    </w:lvl>
-    <w:lvl w:ilvl="7" w:tentative="1">
-      <w:start w:val="1"/>
-      <w:numFmt w:val="decimal"/>
-      <w:lvlText w:val="%8."/>
-      <w:lvlJc w:val="left"/>
-      <w:pPr>
-        <w:tabs>
-          <w:tab w:val="num" w:pos="5760"/>
-        </w:tabs>
-        <w:ind w:left="5760" w:hanging="360"/>
-      </w:pPr>
-    </w:lvl>
-    <w:lvl w:ilvl="8" w:tentative="1">
-      <w:start w:val="1"/>
-      <w:numFmt w:val="decimal"/>
-      <w:lvlText w:val="%9."/>
-      <w:lvlJc w:val="left"/>
-      <w:pPr>
-        <w:tabs>
-          <w:tab w:val="num" w:pos="6480"/>
-        </w:tabs>
-        <w:ind w:left="6480" w:hanging="360"/>
-      </w:pPr>
-    </w:lvl>
-  </w:abstractNum>
-  <w:abstractNum w:abstractNumId="3" w15:restartNumberingAfterBreak="0">
-    <w:nsid w:val="36AD39DA"/>
-    <w:multiLevelType w:val="multilevel"/>
-    <w:tmpl w:val="1A6CF796"/>
+    <w:tmpl w:val="2DF4613C"/>
     <w:lvl w:ilvl="0">
       <w:start w:val="1"/>
       <w:numFmt w:val="bullet"/>
@@ -8385,10 +9883,123 @@
       </w:rPr>
     </w:lvl>
   </w:abstractNum>
+  <w:abstractNum w:abstractNumId="3" w15:restartNumberingAfterBreak="0">
+    <w:nsid w:val="364C3DB7"/>
+    <w:multiLevelType w:val="multilevel"/>
+    <w:tmpl w:val="BC76B22E"/>
+    <w:lvl w:ilvl="0">
+      <w:start w:val="1"/>
+      <w:numFmt w:val="decimal"/>
+      <w:lvlText w:val="%1."/>
+      <w:lvlJc w:val="left"/>
+      <w:pPr>
+        <w:tabs>
+          <w:tab w:val="num" w:pos="720"/>
+        </w:tabs>
+        <w:ind w:left="720" w:hanging="360"/>
+      </w:pPr>
+    </w:lvl>
+    <w:lvl w:ilvl="1" w:tentative="1">
+      <w:start w:val="1"/>
+      <w:numFmt w:val="decimal"/>
+      <w:lvlText w:val="%2."/>
+      <w:lvlJc w:val="left"/>
+      <w:pPr>
+        <w:tabs>
+          <w:tab w:val="num" w:pos="1440"/>
+        </w:tabs>
+        <w:ind w:left="1440" w:hanging="360"/>
+      </w:pPr>
+    </w:lvl>
+    <w:lvl w:ilvl="2" w:tentative="1">
+      <w:start w:val="1"/>
+      <w:numFmt w:val="decimal"/>
+      <w:lvlText w:val="%3."/>
+      <w:lvlJc w:val="left"/>
+      <w:pPr>
+        <w:tabs>
+          <w:tab w:val="num" w:pos="2160"/>
+        </w:tabs>
+        <w:ind w:left="2160" w:hanging="360"/>
+      </w:pPr>
+    </w:lvl>
+    <w:lvl w:ilvl="3" w:tentative="1">
+      <w:start w:val="1"/>
+      <w:numFmt w:val="decimal"/>
+      <w:lvlText w:val="%4."/>
+      <w:lvlJc w:val="left"/>
+      <w:pPr>
+        <w:tabs>
+          <w:tab w:val="num" w:pos="2880"/>
+        </w:tabs>
+        <w:ind w:left="2880" w:hanging="360"/>
+      </w:pPr>
+    </w:lvl>
+    <w:lvl w:ilvl="4" w:tentative="1">
+      <w:start w:val="1"/>
+      <w:numFmt w:val="decimal"/>
+      <w:lvlText w:val="%5."/>
+      <w:lvlJc w:val="left"/>
+      <w:pPr>
+        <w:tabs>
+          <w:tab w:val="num" w:pos="3600"/>
+        </w:tabs>
+        <w:ind w:left="3600" w:hanging="360"/>
+      </w:pPr>
+    </w:lvl>
+    <w:lvl w:ilvl="5" w:tentative="1">
+      <w:start w:val="1"/>
+      <w:numFmt w:val="decimal"/>
+      <w:lvlText w:val="%6."/>
+      <w:lvlJc w:val="left"/>
+      <w:pPr>
+        <w:tabs>
+          <w:tab w:val="num" w:pos="4320"/>
+        </w:tabs>
+        <w:ind w:left="4320" w:hanging="360"/>
+      </w:pPr>
+    </w:lvl>
+    <w:lvl w:ilvl="6" w:tentative="1">
+      <w:start w:val="1"/>
+      <w:numFmt w:val="decimal"/>
+      <w:lvlText w:val="%7."/>
+      <w:lvlJc w:val="left"/>
+      <w:pPr>
+        <w:tabs>
+          <w:tab w:val="num" w:pos="5040"/>
+        </w:tabs>
+        <w:ind w:left="5040" w:hanging="360"/>
+      </w:pPr>
+    </w:lvl>
+    <w:lvl w:ilvl="7" w:tentative="1">
+      <w:start w:val="1"/>
+      <w:numFmt w:val="decimal"/>
+      <w:lvlText w:val="%8."/>
+      <w:lvlJc w:val="left"/>
+      <w:pPr>
+        <w:tabs>
+          <w:tab w:val="num" w:pos="5760"/>
+        </w:tabs>
+        <w:ind w:left="5760" w:hanging="360"/>
+      </w:pPr>
+    </w:lvl>
+    <w:lvl w:ilvl="8" w:tentative="1">
+      <w:start w:val="1"/>
+      <w:numFmt w:val="decimal"/>
+      <w:lvlText w:val="%9."/>
+      <w:lvlJc w:val="left"/>
+      <w:pPr>
+        <w:tabs>
+          <w:tab w:val="num" w:pos="6480"/>
+        </w:tabs>
+        <w:ind w:left="6480" w:hanging="360"/>
+      </w:pPr>
+    </w:lvl>
+  </w:abstractNum>
   <w:abstractNum w:abstractNumId="4" w15:restartNumberingAfterBreak="0">
-    <w:nsid w:val="4CD14194"/>
+    <w:nsid w:val="36AD39DA"/>
     <w:multiLevelType w:val="multilevel"/>
-    <w:tmpl w:val="3D5E88FA"/>
+    <w:tmpl w:val="1A6CF796"/>
     <w:lvl w:ilvl="0">
       <w:start w:val="1"/>
       <w:numFmt w:val="bullet"/>
@@ -8534,20 +10145,324 @@
       </w:rPr>
     </w:lvl>
   </w:abstractNum>
+  <w:abstractNum w:abstractNumId="5" w15:restartNumberingAfterBreak="0">
+    <w:nsid w:val="42B0192A"/>
+    <w:multiLevelType w:val="multilevel"/>
+    <w:tmpl w:val="4F782FB2"/>
+    <w:lvl w:ilvl="0">
+      <w:start w:val="1"/>
+      <w:numFmt w:val="bullet"/>
+      <w:lvlText w:val=""/>
+      <w:lvlJc w:val="left"/>
+      <w:pPr>
+        <w:tabs>
+          <w:tab w:val="num" w:pos="720"/>
+        </w:tabs>
+        <w:ind w:left="720" w:hanging="360"/>
+      </w:pPr>
+      <w:rPr>
+        <w:rFonts w:ascii="Symbol" w:hAnsi="Symbol" w:hint="default"/>
+        <w:sz w:val="20"/>
+      </w:rPr>
+    </w:lvl>
+    <w:lvl w:ilvl="1" w:tentative="1">
+      <w:start w:val="1"/>
+      <w:numFmt w:val="bullet"/>
+      <w:lvlText w:val="o"/>
+      <w:lvlJc w:val="left"/>
+      <w:pPr>
+        <w:tabs>
+          <w:tab w:val="num" w:pos="1440"/>
+        </w:tabs>
+        <w:ind w:left="1440" w:hanging="360"/>
+      </w:pPr>
+      <w:rPr>
+        <w:rFonts w:ascii="Courier New" w:hAnsi="Courier New" w:hint="default"/>
+        <w:sz w:val="20"/>
+      </w:rPr>
+    </w:lvl>
+    <w:lvl w:ilvl="2" w:tentative="1">
+      <w:start w:val="1"/>
+      <w:numFmt w:val="bullet"/>
+      <w:lvlText w:val=""/>
+      <w:lvlJc w:val="left"/>
+      <w:pPr>
+        <w:tabs>
+          <w:tab w:val="num" w:pos="2160"/>
+        </w:tabs>
+        <w:ind w:left="2160" w:hanging="360"/>
+      </w:pPr>
+      <w:rPr>
+        <w:rFonts w:ascii="Wingdings" w:hAnsi="Wingdings" w:hint="default"/>
+        <w:sz w:val="20"/>
+      </w:rPr>
+    </w:lvl>
+    <w:lvl w:ilvl="3" w:tentative="1">
+      <w:start w:val="1"/>
+      <w:numFmt w:val="bullet"/>
+      <w:lvlText w:val=""/>
+      <w:lvlJc w:val="left"/>
+      <w:pPr>
+        <w:tabs>
+          <w:tab w:val="num" w:pos="2880"/>
+        </w:tabs>
+        <w:ind w:left="2880" w:hanging="360"/>
+      </w:pPr>
+      <w:rPr>
+        <w:rFonts w:ascii="Wingdings" w:hAnsi="Wingdings" w:hint="default"/>
+        <w:sz w:val="20"/>
+      </w:rPr>
+    </w:lvl>
+    <w:lvl w:ilvl="4" w:tentative="1">
+      <w:start w:val="1"/>
+      <w:numFmt w:val="bullet"/>
+      <w:lvlText w:val=""/>
+      <w:lvlJc w:val="left"/>
+      <w:pPr>
+        <w:tabs>
+          <w:tab w:val="num" w:pos="3600"/>
+        </w:tabs>
+        <w:ind w:left="3600" w:hanging="360"/>
+      </w:pPr>
+      <w:rPr>
+        <w:rFonts w:ascii="Wingdings" w:hAnsi="Wingdings" w:hint="default"/>
+        <w:sz w:val="20"/>
+      </w:rPr>
+    </w:lvl>
+    <w:lvl w:ilvl="5" w:tentative="1">
+      <w:start w:val="1"/>
+      <w:numFmt w:val="bullet"/>
+      <w:lvlText w:val=""/>
+      <w:lvlJc w:val="left"/>
+      <w:pPr>
+        <w:tabs>
+          <w:tab w:val="num" w:pos="4320"/>
+        </w:tabs>
+        <w:ind w:left="4320" w:hanging="360"/>
+      </w:pPr>
+      <w:rPr>
+        <w:rFonts w:ascii="Wingdings" w:hAnsi="Wingdings" w:hint="default"/>
+        <w:sz w:val="20"/>
+      </w:rPr>
+    </w:lvl>
+    <w:lvl w:ilvl="6" w:tentative="1">
+      <w:start w:val="1"/>
+      <w:numFmt w:val="bullet"/>
+      <w:lvlText w:val=""/>
+      <w:lvlJc w:val="left"/>
+      <w:pPr>
+        <w:tabs>
+          <w:tab w:val="num" w:pos="5040"/>
+        </w:tabs>
+        <w:ind w:left="5040" w:hanging="360"/>
+      </w:pPr>
+      <w:rPr>
+        <w:rFonts w:ascii="Wingdings" w:hAnsi="Wingdings" w:hint="default"/>
+        <w:sz w:val="20"/>
+      </w:rPr>
+    </w:lvl>
+    <w:lvl w:ilvl="7" w:tentative="1">
+      <w:start w:val="1"/>
+      <w:numFmt w:val="bullet"/>
+      <w:lvlText w:val=""/>
+      <w:lvlJc w:val="left"/>
+      <w:pPr>
+        <w:tabs>
+          <w:tab w:val="num" w:pos="5760"/>
+        </w:tabs>
+        <w:ind w:left="5760" w:hanging="360"/>
+      </w:pPr>
+      <w:rPr>
+        <w:rFonts w:ascii="Wingdings" w:hAnsi="Wingdings" w:hint="default"/>
+        <w:sz w:val="20"/>
+      </w:rPr>
+    </w:lvl>
+    <w:lvl w:ilvl="8" w:tentative="1">
+      <w:start w:val="1"/>
+      <w:numFmt w:val="bullet"/>
+      <w:lvlText w:val=""/>
+      <w:lvlJc w:val="left"/>
+      <w:pPr>
+        <w:tabs>
+          <w:tab w:val="num" w:pos="6480"/>
+        </w:tabs>
+        <w:ind w:left="6480" w:hanging="360"/>
+      </w:pPr>
+      <w:rPr>
+        <w:rFonts w:ascii="Wingdings" w:hAnsi="Wingdings" w:hint="default"/>
+        <w:sz w:val="20"/>
+      </w:rPr>
+    </w:lvl>
+  </w:abstractNum>
+  <w:abstractNum w:abstractNumId="6" w15:restartNumberingAfterBreak="0">
+    <w:nsid w:val="4CD14194"/>
+    <w:multiLevelType w:val="multilevel"/>
+    <w:tmpl w:val="3D5E88FA"/>
+    <w:lvl w:ilvl="0">
+      <w:start w:val="1"/>
+      <w:numFmt w:val="bullet"/>
+      <w:lvlText w:val=""/>
+      <w:lvlJc w:val="left"/>
+      <w:pPr>
+        <w:tabs>
+          <w:tab w:val="num" w:pos="720"/>
+        </w:tabs>
+        <w:ind w:left="720" w:hanging="360"/>
+      </w:pPr>
+      <w:rPr>
+        <w:rFonts w:ascii="Symbol" w:hAnsi="Symbol" w:hint="default"/>
+        <w:sz w:val="20"/>
+      </w:rPr>
+    </w:lvl>
+    <w:lvl w:ilvl="1" w:tentative="1">
+      <w:start w:val="1"/>
+      <w:numFmt w:val="bullet"/>
+      <w:lvlText w:val="o"/>
+      <w:lvlJc w:val="left"/>
+      <w:pPr>
+        <w:tabs>
+          <w:tab w:val="num" w:pos="1440"/>
+        </w:tabs>
+        <w:ind w:left="1440" w:hanging="360"/>
+      </w:pPr>
+      <w:rPr>
+        <w:rFonts w:ascii="Courier New" w:hAnsi="Courier New" w:hint="default"/>
+        <w:sz w:val="20"/>
+      </w:rPr>
+    </w:lvl>
+    <w:lvl w:ilvl="2" w:tentative="1">
+      <w:start w:val="1"/>
+      <w:numFmt w:val="bullet"/>
+      <w:lvlText w:val=""/>
+      <w:lvlJc w:val="left"/>
+      <w:pPr>
+        <w:tabs>
+          <w:tab w:val="num" w:pos="2160"/>
+        </w:tabs>
+        <w:ind w:left="2160" w:hanging="360"/>
+      </w:pPr>
+      <w:rPr>
+        <w:rFonts w:ascii="Wingdings" w:hAnsi="Wingdings" w:hint="default"/>
+        <w:sz w:val="20"/>
+      </w:rPr>
+    </w:lvl>
+    <w:lvl w:ilvl="3" w:tentative="1">
+      <w:start w:val="1"/>
+      <w:numFmt w:val="bullet"/>
+      <w:lvlText w:val=""/>
+      <w:lvlJc w:val="left"/>
+      <w:pPr>
+        <w:tabs>
+          <w:tab w:val="num" w:pos="2880"/>
+        </w:tabs>
+        <w:ind w:left="2880" w:hanging="360"/>
+      </w:pPr>
+      <w:rPr>
+        <w:rFonts w:ascii="Wingdings" w:hAnsi="Wingdings" w:hint="default"/>
+        <w:sz w:val="20"/>
+      </w:rPr>
+    </w:lvl>
+    <w:lvl w:ilvl="4" w:tentative="1">
+      <w:start w:val="1"/>
+      <w:numFmt w:val="bullet"/>
+      <w:lvlText w:val=""/>
+      <w:lvlJc w:val="left"/>
+      <w:pPr>
+        <w:tabs>
+          <w:tab w:val="num" w:pos="3600"/>
+        </w:tabs>
+        <w:ind w:left="3600" w:hanging="360"/>
+      </w:pPr>
+      <w:rPr>
+        <w:rFonts w:ascii="Wingdings" w:hAnsi="Wingdings" w:hint="default"/>
+        <w:sz w:val="20"/>
+      </w:rPr>
+    </w:lvl>
+    <w:lvl w:ilvl="5" w:tentative="1">
+      <w:start w:val="1"/>
+      <w:numFmt w:val="bullet"/>
+      <w:lvlText w:val=""/>
+      <w:lvlJc w:val="left"/>
+      <w:pPr>
+        <w:tabs>
+          <w:tab w:val="num" w:pos="4320"/>
+        </w:tabs>
+        <w:ind w:left="4320" w:hanging="360"/>
+      </w:pPr>
+      <w:rPr>
+        <w:rFonts w:ascii="Wingdings" w:hAnsi="Wingdings" w:hint="default"/>
+        <w:sz w:val="20"/>
+      </w:rPr>
+    </w:lvl>
+    <w:lvl w:ilvl="6" w:tentative="1">
+      <w:start w:val="1"/>
+      <w:numFmt w:val="bullet"/>
+      <w:lvlText w:val=""/>
+      <w:lvlJc w:val="left"/>
+      <w:pPr>
+        <w:tabs>
+          <w:tab w:val="num" w:pos="5040"/>
+        </w:tabs>
+        <w:ind w:left="5040" w:hanging="360"/>
+      </w:pPr>
+      <w:rPr>
+        <w:rFonts w:ascii="Wingdings" w:hAnsi="Wingdings" w:hint="default"/>
+        <w:sz w:val="20"/>
+      </w:rPr>
+    </w:lvl>
+    <w:lvl w:ilvl="7" w:tentative="1">
+      <w:start w:val="1"/>
+      <w:numFmt w:val="bullet"/>
+      <w:lvlText w:val=""/>
+      <w:lvlJc w:val="left"/>
+      <w:pPr>
+        <w:tabs>
+          <w:tab w:val="num" w:pos="5760"/>
+        </w:tabs>
+        <w:ind w:left="5760" w:hanging="360"/>
+      </w:pPr>
+      <w:rPr>
+        <w:rFonts w:ascii="Wingdings" w:hAnsi="Wingdings" w:hint="default"/>
+        <w:sz w:val="20"/>
+      </w:rPr>
+    </w:lvl>
+    <w:lvl w:ilvl="8" w:tentative="1">
+      <w:start w:val="1"/>
+      <w:numFmt w:val="bullet"/>
+      <w:lvlText w:val=""/>
+      <w:lvlJc w:val="left"/>
+      <w:pPr>
+        <w:tabs>
+          <w:tab w:val="num" w:pos="6480"/>
+        </w:tabs>
+        <w:ind w:left="6480" w:hanging="360"/>
+      </w:pPr>
+      <w:rPr>
+        <w:rFonts w:ascii="Wingdings" w:hAnsi="Wingdings" w:hint="default"/>
+        <w:sz w:val="20"/>
+      </w:rPr>
+    </w:lvl>
+  </w:abstractNum>
   <w:num w:numId="1" w16cid:durableId="1512986774">
     <w:abstractNumId w:val="0"/>
   </w:num>
   <w:num w:numId="2" w16cid:durableId="412095744">
-    <w:abstractNumId w:val="2"/>
+    <w:abstractNumId w:val="3"/>
   </w:num>
   <w:num w:numId="3" w16cid:durableId="902181921">
-    <w:abstractNumId w:val="4"/>
+    <w:abstractNumId w:val="6"/>
   </w:num>
   <w:num w:numId="4" w16cid:durableId="1854568081">
     <w:abstractNumId w:val="1"/>
   </w:num>
   <w:num w:numId="5" w16cid:durableId="1970669542">
-    <w:abstractNumId w:val="3"/>
+    <w:abstractNumId w:val="4"/>
+  </w:num>
+  <w:num w:numId="6" w16cid:durableId="271938369">
+    <w:abstractNumId w:val="5"/>
+  </w:num>
+  <w:num w:numId="7" w16cid:durableId="1350907536">
+    <w:abstractNumId w:val="2"/>
   </w:num>
 </w:numbering>
 </file>

</xml_diff>